<commit_message>
docs: add github repository link
</commit_message>
<xml_diff>
--- a/output/doc/mdseek_Rust课程期末报告.docx
+++ b/output/doc/mdseek_Rust课程期末报告.docx
@@ -197,10 +197,8 @@
       <w:r>
         <w:rPr>
           <w:rFonts w:ascii="宋体" w:hAnsi="宋体" w:eastAsia="宋体"/>
-          <w:b w:val="0"/>
-          <w:sz w:val="22"/>
-        </w:rPr>
-        <w:t>• GitHub 链接：待提交仓库后填写；当前本地路径为 /Users/lizhengrong/Codefield/rustfinal</w:t>
+        </w:rPr>
+        <w:t>• GitHub 链接：https://github.com/lildayuan/nk-mdseek-rust-final</w:t>
       </w:r>
     </w:p>
     <w:p>

</xml_diff>